<commit_message>
Sign the Definition of Done and the contribution record
The four-member sign-off the checklist itself required is now recorded, dated
20 October, and it says plainly that signing means the completed items are Done
and the remaining gaps are stated, not that every item is met. 28 of the 31
items are ticked, each naming the file that supports it; three are left unticked
with the reason beside them - timeouts, which the model has no timer to raise,
role-aware forms, which is the same defect AT-03 records, and the commit-message
convention, which was written down and never applied.

Where an item named a folder the repository never created, the tick carries the
path the work is actually in rather than pretending the folder exists.

The contribution record carries Ender's review, with what he confirmed and the
three limits on that confirmation written out. The index, the README and the
second-release test plan no longer describe either document as unsigned.
</commit_message>
<xml_diff>
--- a/submissions/BPMEA/Group_Project_and_Test_Plan_2026-10-20.docx
+++ b/submissions/BPMEA/Group_Project_and_Test_Plan_2026-10-20.docx
@@ -5752,41 +5752,28 @@
         <w:pStyle w:val="FirstParagraph"/>
       </w:pPr>
       <w:r>
-        <w:t xml:space="preserve">Second-owner review is mixed. The strategic model's review was signed on 19 October (section 7 of</w:t>
-      </w:r>
-      <w:r>
-        <w:t xml:space="preserve"> </w:t>
-      </w:r>
+        <w:t>Second-owner review is mixed. The strategic model's review was signed on 19 October (section 7 of docs/strategic-bpmn/PB-12_abstraction-level_2026-09-29.md). The i* SD/SR review was signed on 20 October and accepted the delivered figures with the corrections recorded but not applied (section 12 of the same notes); the Definition of Done carries a four-member sign-off dated 20 October (docs/definition-of-done.md), with three items left unticked and the reason written beside each.</w:t>
+      </w:r>
+      <w:r/>
       <w:r>
         <w:rPr>
           <w:rStyle w:val="VerbatimChar"/>
         </w:rPr>
-        <w:t xml:space="preserve">docs/strategic-bpmn/PB-12_abstraction-level_2026-09-29.md</w:t>
-      </w:r>
-      <w:r>
-        <w:t xml:space="preserve">). The i* SD/SR second-owner checklist is still unsigned (the PB-16 row in</w:t>
-      </w:r>
-      <w:r>
-        <w:t xml:space="preserve"> </w:t>
-      </w:r>
+      </w:r>
+      <w:r/>
+      <w:r/>
       <w:r>
         <w:rPr>
           <w:rStyle w:val="VerbatimChar"/>
         </w:rPr>
-        <w:t xml:space="preserve">docs/p3-product-backlog.md</w:t>
-      </w:r>
-      <w:r>
-        <w:t xml:space="preserve">), and the Definition of Done has no group sign-off (</w:t>
-      </w:r>
+      </w:r>
+      <w:r/>
       <w:r>
         <w:rPr>
           <w:rStyle w:val="VerbatimChar"/>
         </w:rPr>
-        <w:t xml:space="preserve">docs/definition-of-done.md</w:t>
-      </w:r>
-      <w:r>
-        <w:t xml:space="preserve">).</w:t>
-      </w:r>
+      </w:r>
+      <w:r/>
     </w:p>
     <w:p>
       <w:pPr>

</xml_diff>